<commit_message>
Update Echo Design Plan document with latest revisions
</commit_message>
<xml_diff>
--- a/Echo Design Plan.docx
+++ b/Echo Design Plan.docx
@@ -16,18 +16,18 @@
         <w:rPr>
           <w:b/>
           <w:bCs/>
+        </w:rPr>
+        <w:t>Echo</w:t>
+      </w:r>
+      <w:r>
+        <w:rPr>
+          <w:rFonts w:ascii="Calibri" w:hAnsi="Calibri" w:eastAsia="Calibri" w:cs="Calibri" w:asciiTheme="minorHAnsi" w:hAnsiTheme="minorHAnsi" w:eastAsiaTheme="minorHAnsi" w:csTheme="minorBidi"/>
+          <w:b/>
+          <w:bCs/>
+          <w:kern w:val="2"/>
           <w:sz w:val="40"/>
           <w:szCs w:val="40"/>
         </w:rPr>
-        <w:t>Neura</w:t>
-      </w:r>
-      <w:r>
-        <w:rPr>
-          <w:b/>
-          <w:bCs/>
-          <w:sz w:val="40"/>
-          <w:szCs w:val="40"/>
-        </w:rPr>
         <w:t xml:space="preserve"> Design Plan – Version 1.0</w:t>
       </w:r>
     </w:p>
@@ -51,13 +51,28 @@
       </w:r>
     </w:p>
     <w:p>
-      <w:r>
+      <w:pPr>
+        <w:spacing w:after="160" w:line="259" w:lineRule="auto"/>
+      </w:pPr>
+      <w:r>
+        <w:rPr>
+          <w:rFonts w:ascii="Calibri" w:hAnsi="Calibri" w:eastAsia="Calibri" w:cs="Calibri" w:asciiTheme="minorHAnsi" w:hAnsiTheme="minorHAnsi" w:eastAsiaTheme="minorHAnsi" w:csTheme="minorBidi"/>
+          <w:kern w:val="2"/>
+          <w:sz w:val="22"/>
+          <w:szCs w:val="22"/>
+        </w:rPr>
         <w:t xml:space="preserve">This document outlines the design plan for </w:t>
       </w:r>
       <w:r>
-        <w:t>Neura</w:t>
-      </w:r>
-      <w:r>
+        <w:t>Echo</w:t>
+      </w:r>
+      <w:r>
+        <w:rPr>
+          <w:rFonts w:ascii="Calibri" w:hAnsi="Calibri" w:eastAsia="Calibri" w:cs="Calibri" w:asciiTheme="minorHAnsi" w:hAnsiTheme="minorHAnsi" w:eastAsiaTheme="minorHAnsi" w:csTheme="minorBidi"/>
+          <w:kern w:val="2"/>
+          <w:sz w:val="22"/>
+          <w:szCs w:val="22"/>
+        </w:rPr>
         <w:t>, a general-purpose programming language with a focus on readability, simplicity, and futuristic features like native parallelism, event-driven programming, AI support, and interoperability. The core strengths are planned for future implementation, while the current focus is on building a solid foundation with unique syntax and an easy learning curve.</w:t>
       </w:r>
     </w:p>
@@ -135,10 +150,17 @@
       </w:pPr>
       <w:r>
         <w:rPr>
-          <w:b/>
-          <w:bCs/>
-        </w:rPr>
-        <w:t>Variable Declaration in Neura</w:t>
+          <w:rFonts w:ascii="Calibri" w:hAnsi="Calibri" w:eastAsia="Calibri" w:cs="Calibri" w:asciiTheme="minorHAnsi" w:hAnsiTheme="minorHAnsi" w:eastAsiaTheme="minorHAnsi" w:csTheme="minorBidi"/>
+          <w:b/>
+          <w:bCs/>
+          <w:kern w:val="2"/>
+          <w:sz w:val="22"/>
+          <w:szCs w:val="22"/>
+        </w:rPr>
+        <w:t xml:space="preserve">Variable Declaration in </w:t>
+      </w:r>
+      <w:r>
+        <w:t>Echo</w:t>
       </w:r>
     </w:p>
     <w:p>
@@ -1702,13 +1724,28 @@
       </w:r>
     </w:p>
     <w:p>
-      <w:r>
+      <w:pPr>
+        <w:spacing w:after="160" w:line="259" w:lineRule="auto"/>
+      </w:pPr>
+      <w:r>
+        <w:rPr>
+          <w:rFonts w:ascii="Calibri" w:hAnsi="Calibri" w:eastAsia="Calibri" w:cs="Calibri" w:asciiTheme="minorHAnsi" w:hAnsiTheme="minorHAnsi" w:eastAsiaTheme="minorHAnsi" w:csTheme="minorBidi"/>
+          <w:kern w:val="2"/>
+          <w:sz w:val="22"/>
+          <w:szCs w:val="22"/>
+        </w:rPr>
         <w:t xml:space="preserve">The </w:t>
       </w:r>
       <w:r>
-        <w:t>Neura</w:t>
-      </w:r>
-      <w:r>
+        <w:t>Echo</w:t>
+      </w:r>
+      <w:r>
+        <w:rPr>
+          <w:rFonts w:ascii="Calibri" w:hAnsi="Calibri" w:eastAsia="Calibri" w:cs="Calibri" w:asciiTheme="minorHAnsi" w:hAnsiTheme="minorHAnsi" w:eastAsiaTheme="minorHAnsi" w:csTheme="minorBidi"/>
+          <w:kern w:val="2"/>
+          <w:sz w:val="22"/>
+          <w:szCs w:val="22"/>
+        </w:rPr>
         <w:t xml:space="preserve"> aims to combine simplicity with power, providing developers with an intuitive syntax while offering unique strengths like parallelism, concurrency, and future AI integration. The initial focus is to ensure a stable core, with advanced features added iteratively.</w:t>
       </w:r>
     </w:p>
@@ -1767,7 +1804,7 @@
 </file>
 
 <file path=word/footer1.xml><?xml version="1.0" encoding="utf-8"?>
-<w:ftr xmlns:wpc="http://schemas.microsoft.com/office/word/2010/wordprocessingCanvas" xmlns:cx="http://schemas.microsoft.com/office/drawing/2014/chartex" xmlns:cx1="http://schemas.microsoft.com/office/drawing/2015/9/8/chartex" xmlns:cx2="http://schemas.microsoft.com/office/drawing/2015/10/21/chartex" xmlns:cx3="http://schemas.microsoft.com/office/drawing/2016/5/9/chartex" xmlns:cx4="http://schemas.microsoft.com/office/drawing/2016/5/10/chartex" xmlns:cx5="http://schemas.microsoft.com/office/drawing/2016/5/11/chartex" xmlns:cx6="http://schemas.microsoft.com/office/drawing/2016/5/12/chartex" xmlns:cx7="http://schemas.microsoft.com/office/drawing/2016/5/13/chartex" xmlns:cx8="http://schemas.microsoft.com/office/drawing/2016/5/14/chartex" xmlns:mc="http://schemas.openxmlformats.org/markup-compatibility/2006" xmlns:aink="http://schemas.microsoft.com/office/drawing/2016/ink" xmlns:am3d="http://schemas.microsoft.com/office/drawing/2017/model3d" xmlns:o="urn:schemas-microsoft-com:office:office" xmlns:oel="http://schemas.microsoft.com/office/2019/extlst" xmlns:r="http://schemas.openxmlformats.org/officeDocument/2006/relationships" xmlns:m="http://schemas.openxmlformats.org/officeDocument/2006/math" xmlns:v="urn:schemas-microsoft-com:vml" xmlns:wp14="http://schemas.microsoft.com/office/word/2010/wordprocessingDrawing" xmlns:wp="http://schemas.openxmlformats.org/drawingml/2006/wordprocessingDrawing" xmlns:w10="urn:schemas-microsoft-com:office:word" xmlns:w="http://schemas.openxmlformats.org/wordprocessingml/2006/main" xmlns:w14="http://schemas.microsoft.com/office/word/2010/wordml" xmlns:w15="http://schemas.microsoft.com/office/word/2012/wordml" xmlns:w16cex="http://schemas.microsoft.com/office/word/2018/wordml/cex" xmlns:w16cid="http://schemas.microsoft.com/office/word/2016/wordml/cid" xmlns:w16="http://schemas.microsoft.com/office/word/2018/wordml" xmlns:w16du="http://schemas.microsoft.com/office/word/2023/wordml/word16du" xmlns:w16sdtdh="http://schemas.microsoft.com/office/word/2020/wordml/sdtdatahash" xmlns:w16sdtfl="http://schemas.microsoft.com/office/word/2024/wordml/sdtformatlock" xmlns:w16se="http://schemas.microsoft.com/office/word/2015/wordml/symex" xmlns:wpg="http://schemas.microsoft.com/office/word/2010/wordprocessingGroup" xmlns:wpi="http://schemas.microsoft.com/office/word/2010/wordprocessingInk" xmlns:wne="http://schemas.microsoft.com/office/word/2006/wordml" xmlns:wps="http://schemas.microsoft.com/office/word/2010/wordprocessingShape" mc:Ignorable="w14 w15 w16se w16cid w16 w16cex w16sdtdh w16sdtfl w16du wp14">
+<w:ftr xmlns:wpc="http://schemas.microsoft.com/office/word/2010/wordprocessingCanvas" xmlns:mc="http://schemas.openxmlformats.org/markup-compatibility/2006" xmlns:o="urn:schemas-microsoft-com:office:office" xmlns:r="http://schemas.openxmlformats.org/officeDocument/2006/relationships" xmlns:m="http://schemas.openxmlformats.org/officeDocument/2006/math" xmlns:v="urn:schemas-microsoft-com:vml" xmlns:wp14="http://schemas.microsoft.com/office/word/2010/wordprocessingDrawing" xmlns:wp="http://schemas.openxmlformats.org/drawingml/2006/wordprocessingDrawing" xmlns:w10="urn:schemas-microsoft-com:office:word" xmlns:w="http://schemas.openxmlformats.org/wordprocessingml/2006/main" xmlns:w14="http://schemas.microsoft.com/office/word/2010/wordml" xmlns:w15="http://schemas.microsoft.com/office/word/2012/wordml" xmlns:w16se="http://schemas.microsoft.com/office/word/2015/wordml/symex" xmlns:w16cid="http://schemas.microsoft.com/office/word/2016/wordml/cid" xmlns:w16="http://schemas.microsoft.com/office/word/2018/wordml" xmlns:w16cex="http://schemas.microsoft.com/office/word/2018/wordml/cex" xmlns:w16sdtdh="http://schemas.microsoft.com/office/word/2020/wordml/sdtdatahash" xmlns:wne="http://schemas.microsoft.com/office/word/2006/wordml" xmlns:wpg="http://schemas.microsoft.com/office/word/2010/wordprocessingGroup" xmlns:wps="http://schemas.microsoft.com/office/word/2010/wordprocessingShape">
   <w:p>
     <w:pPr>
       <w:pStyle w:val="Footer"/>
@@ -1777,7 +1814,7 @@
 </file>
 
 <file path=word/footer2.xml><?xml version="1.0" encoding="utf-8"?>
-<w:ftr xmlns:wpc="http://schemas.microsoft.com/office/word/2010/wordprocessingCanvas" xmlns:cx="http://schemas.microsoft.com/office/drawing/2014/chartex" xmlns:cx1="http://schemas.microsoft.com/office/drawing/2015/9/8/chartex" xmlns:cx2="http://schemas.microsoft.com/office/drawing/2015/10/21/chartex" xmlns:cx3="http://schemas.microsoft.com/office/drawing/2016/5/9/chartex" xmlns:cx4="http://schemas.microsoft.com/office/drawing/2016/5/10/chartex" xmlns:cx5="http://schemas.microsoft.com/office/drawing/2016/5/11/chartex" xmlns:cx6="http://schemas.microsoft.com/office/drawing/2016/5/12/chartex" xmlns:cx7="http://schemas.microsoft.com/office/drawing/2016/5/13/chartex" xmlns:cx8="http://schemas.microsoft.com/office/drawing/2016/5/14/chartex" xmlns:mc="http://schemas.openxmlformats.org/markup-compatibility/2006" xmlns:aink="http://schemas.microsoft.com/office/drawing/2016/ink" xmlns:am3d="http://schemas.microsoft.com/office/drawing/2017/model3d" xmlns:o="urn:schemas-microsoft-com:office:office" xmlns:oel="http://schemas.microsoft.com/office/2019/extlst" xmlns:r="http://schemas.openxmlformats.org/officeDocument/2006/relationships" xmlns:m="http://schemas.openxmlformats.org/officeDocument/2006/math" xmlns:v="urn:schemas-microsoft-com:vml" xmlns:wp14="http://schemas.microsoft.com/office/word/2010/wordprocessingDrawing" xmlns:wp="http://schemas.openxmlformats.org/drawingml/2006/wordprocessingDrawing" xmlns:w10="urn:schemas-microsoft-com:office:word" xmlns:w="http://schemas.openxmlformats.org/wordprocessingml/2006/main" xmlns:w14="http://schemas.microsoft.com/office/word/2010/wordml" xmlns:w15="http://schemas.microsoft.com/office/word/2012/wordml" xmlns:w16cex="http://schemas.microsoft.com/office/word/2018/wordml/cex" xmlns:w16cid="http://schemas.microsoft.com/office/word/2016/wordml/cid" xmlns:w16="http://schemas.microsoft.com/office/word/2018/wordml" xmlns:w16du="http://schemas.microsoft.com/office/word/2023/wordml/word16du" xmlns:w16sdtdh="http://schemas.microsoft.com/office/word/2020/wordml/sdtdatahash" xmlns:w16sdtfl="http://schemas.microsoft.com/office/word/2024/wordml/sdtformatlock" xmlns:w16se="http://schemas.microsoft.com/office/word/2015/wordml/symex" xmlns:wpg="http://schemas.microsoft.com/office/word/2010/wordprocessingGroup" xmlns:wpi="http://schemas.microsoft.com/office/word/2010/wordprocessingInk" xmlns:wne="http://schemas.microsoft.com/office/word/2006/wordml" xmlns:wps="http://schemas.microsoft.com/office/word/2010/wordprocessingShape" mc:Ignorable="w14 w15 w16se w16cid w16 w16cex w16sdtdh w16sdtfl w16du wp14">
+<w:ftr xmlns:wpc="http://schemas.microsoft.com/office/word/2010/wordprocessingCanvas" xmlns:mc="http://schemas.openxmlformats.org/markup-compatibility/2006" xmlns:o="urn:schemas-microsoft-com:office:office" xmlns:r="http://schemas.openxmlformats.org/officeDocument/2006/relationships" xmlns:m="http://schemas.openxmlformats.org/officeDocument/2006/math" xmlns:v="urn:schemas-microsoft-com:vml" xmlns:wp14="http://schemas.microsoft.com/office/word/2010/wordprocessingDrawing" xmlns:wp="http://schemas.openxmlformats.org/drawingml/2006/wordprocessingDrawing" xmlns:w10="urn:schemas-microsoft-com:office:word" xmlns:w="http://schemas.openxmlformats.org/wordprocessingml/2006/main" xmlns:w14="http://schemas.microsoft.com/office/word/2010/wordml" xmlns:w15="http://schemas.microsoft.com/office/word/2012/wordml" xmlns:w16se="http://schemas.microsoft.com/office/word/2015/wordml/symex" xmlns:w16cid="http://schemas.microsoft.com/office/word/2016/wordml/cid" xmlns:w16="http://schemas.microsoft.com/office/word/2018/wordml" xmlns:w16cex="http://schemas.microsoft.com/office/word/2018/wordml/cex" xmlns:w16sdtdh="http://schemas.microsoft.com/office/word/2020/wordml/sdtdatahash" xmlns:wne="http://schemas.microsoft.com/office/word/2006/wordml" xmlns:wpg="http://schemas.microsoft.com/office/word/2010/wordprocessingGroup" xmlns:wps="http://schemas.microsoft.com/office/word/2010/wordprocessingShape">
   <w:p>
     <w:pPr>
       <w:pStyle w:val="Footer"/>
@@ -1787,7 +1824,7 @@
 </file>
 
 <file path=word/footer3.xml><?xml version="1.0" encoding="utf-8"?>
-<w:ftr xmlns:wpc="http://schemas.microsoft.com/office/word/2010/wordprocessingCanvas" xmlns:cx="http://schemas.microsoft.com/office/drawing/2014/chartex" xmlns:cx1="http://schemas.microsoft.com/office/drawing/2015/9/8/chartex" xmlns:cx2="http://schemas.microsoft.com/office/drawing/2015/10/21/chartex" xmlns:cx3="http://schemas.microsoft.com/office/drawing/2016/5/9/chartex" xmlns:cx4="http://schemas.microsoft.com/office/drawing/2016/5/10/chartex" xmlns:cx5="http://schemas.microsoft.com/office/drawing/2016/5/11/chartex" xmlns:cx6="http://schemas.microsoft.com/office/drawing/2016/5/12/chartex" xmlns:cx7="http://schemas.microsoft.com/office/drawing/2016/5/13/chartex" xmlns:cx8="http://schemas.microsoft.com/office/drawing/2016/5/14/chartex" xmlns:mc="http://schemas.openxmlformats.org/markup-compatibility/2006" xmlns:aink="http://schemas.microsoft.com/office/drawing/2016/ink" xmlns:am3d="http://schemas.microsoft.com/office/drawing/2017/model3d" xmlns:o="urn:schemas-microsoft-com:office:office" xmlns:oel="http://schemas.microsoft.com/office/2019/extlst" xmlns:r="http://schemas.openxmlformats.org/officeDocument/2006/relationships" xmlns:m="http://schemas.openxmlformats.org/officeDocument/2006/math" xmlns:v="urn:schemas-microsoft-com:vml" xmlns:wp14="http://schemas.microsoft.com/office/word/2010/wordprocessingDrawing" xmlns:wp="http://schemas.openxmlformats.org/drawingml/2006/wordprocessingDrawing" xmlns:w10="urn:schemas-microsoft-com:office:word" xmlns:w="http://schemas.openxmlformats.org/wordprocessingml/2006/main" xmlns:w14="http://schemas.microsoft.com/office/word/2010/wordml" xmlns:w15="http://schemas.microsoft.com/office/word/2012/wordml" xmlns:w16cex="http://schemas.microsoft.com/office/word/2018/wordml/cex" xmlns:w16cid="http://schemas.microsoft.com/office/word/2016/wordml/cid" xmlns:w16="http://schemas.microsoft.com/office/word/2018/wordml" xmlns:w16du="http://schemas.microsoft.com/office/word/2023/wordml/word16du" xmlns:w16sdtdh="http://schemas.microsoft.com/office/word/2020/wordml/sdtdatahash" xmlns:w16sdtfl="http://schemas.microsoft.com/office/word/2024/wordml/sdtformatlock" xmlns:w16se="http://schemas.microsoft.com/office/word/2015/wordml/symex" xmlns:wpg="http://schemas.microsoft.com/office/word/2010/wordprocessingGroup" xmlns:wpi="http://schemas.microsoft.com/office/word/2010/wordprocessingInk" xmlns:wne="http://schemas.microsoft.com/office/word/2006/wordml" xmlns:wps="http://schemas.microsoft.com/office/word/2010/wordprocessingShape" mc:Ignorable="w14 w15 w16se w16cid w16 w16cex w16sdtdh w16sdtfl w16du wp14">
+<w:ftr xmlns:wpc="http://schemas.microsoft.com/office/word/2010/wordprocessingCanvas" xmlns:mc="http://schemas.openxmlformats.org/markup-compatibility/2006" xmlns:o="urn:schemas-microsoft-com:office:office" xmlns:r="http://schemas.openxmlformats.org/officeDocument/2006/relationships" xmlns:m="http://schemas.openxmlformats.org/officeDocument/2006/math" xmlns:v="urn:schemas-microsoft-com:vml" xmlns:wp14="http://schemas.microsoft.com/office/word/2010/wordprocessingDrawing" xmlns:wp="http://schemas.openxmlformats.org/drawingml/2006/wordprocessingDrawing" xmlns:w10="urn:schemas-microsoft-com:office:word" xmlns:w="http://schemas.openxmlformats.org/wordprocessingml/2006/main" xmlns:w14="http://schemas.microsoft.com/office/word/2010/wordml" xmlns:w15="http://schemas.microsoft.com/office/word/2012/wordml" xmlns:w16se="http://schemas.microsoft.com/office/word/2015/wordml/symex" xmlns:w16cid="http://schemas.microsoft.com/office/word/2016/wordml/cid" xmlns:w16="http://schemas.microsoft.com/office/word/2018/wordml" xmlns:w16cex="http://schemas.microsoft.com/office/word/2018/wordml/cex" xmlns:w16sdtdh="http://schemas.microsoft.com/office/word/2020/wordml/sdtdatahash" xmlns:wne="http://schemas.microsoft.com/office/word/2006/wordml" xmlns:wpg="http://schemas.microsoft.com/office/word/2010/wordprocessingGroup" xmlns:wps="http://schemas.microsoft.com/office/word/2010/wordprocessingShape">
   <w:p>
     <w:pPr>
       <w:pStyle w:val="Footer"/>
@@ -1822,16 +1859,13 @@
 </file>
 
 <file path=word/header1.xml><?xml version="1.0" encoding="utf-8"?>
-<w:hdr xmlns:wpc="http://schemas.microsoft.com/office/word/2010/wordprocessingCanvas" xmlns:cx="http://schemas.microsoft.com/office/drawing/2014/chartex" xmlns:cx1="http://schemas.microsoft.com/office/drawing/2015/9/8/chartex" xmlns:cx2="http://schemas.microsoft.com/office/drawing/2015/10/21/chartex" xmlns:cx3="http://schemas.microsoft.com/office/drawing/2016/5/9/chartex" xmlns:cx4="http://schemas.microsoft.com/office/drawing/2016/5/10/chartex" xmlns:cx5="http://schemas.microsoft.com/office/drawing/2016/5/11/chartex" xmlns:cx6="http://schemas.microsoft.com/office/drawing/2016/5/12/chartex" xmlns:cx7="http://schemas.microsoft.com/office/drawing/2016/5/13/chartex" xmlns:cx8="http://schemas.microsoft.com/office/drawing/2016/5/14/chartex" xmlns:mc="http://schemas.openxmlformats.org/markup-compatibility/2006" xmlns:aink="http://schemas.microsoft.com/office/drawing/2016/ink" xmlns:am3d="http://schemas.microsoft.com/office/drawing/2017/model3d" xmlns:o="urn:schemas-microsoft-com:office:office" xmlns:oel="http://schemas.microsoft.com/office/2019/extlst" xmlns:r="http://schemas.openxmlformats.org/officeDocument/2006/relationships" xmlns:m="http://schemas.openxmlformats.org/officeDocument/2006/math" xmlns:v="urn:schemas-microsoft-com:vml" xmlns:wp14="http://schemas.microsoft.com/office/word/2010/wordprocessingDrawing" xmlns:wp="http://schemas.openxmlformats.org/drawingml/2006/wordprocessingDrawing" xmlns:w10="urn:schemas-microsoft-com:office:word" xmlns:w="http://schemas.openxmlformats.org/wordprocessingml/2006/main" xmlns:w14="http://schemas.microsoft.com/office/word/2010/wordml" xmlns:w15="http://schemas.microsoft.com/office/word/2012/wordml" xmlns:w16cex="http://schemas.microsoft.com/office/word/2018/wordml/cex" xmlns:w16cid="http://schemas.microsoft.com/office/word/2016/wordml/cid" xmlns:w16="http://schemas.microsoft.com/office/word/2018/wordml" xmlns:w16du="http://schemas.microsoft.com/office/word/2023/wordml/word16du" xmlns:w16sdtdh="http://schemas.microsoft.com/office/word/2020/wordml/sdtdatahash" xmlns:w16sdtfl="http://schemas.microsoft.com/office/word/2024/wordml/sdtformatlock" xmlns:w16se="http://schemas.microsoft.com/office/word/2015/wordml/symex" xmlns:wpg="http://schemas.microsoft.com/office/word/2010/wordprocessingGroup" xmlns:wpi="http://schemas.microsoft.com/office/word/2010/wordprocessingInk" xmlns:wne="http://schemas.microsoft.com/office/word/2006/wordml" xmlns:wps="http://schemas.microsoft.com/office/word/2010/wordprocessingShape" mc:Ignorable="w14 w15 w16se w16cid w16 w16cex w16sdtdh w16sdtfl w16du wp14">
+<w:hdr xmlns:wpc="http://schemas.microsoft.com/office/word/2010/wordprocessingCanvas" xmlns:mc="http://schemas.openxmlformats.org/markup-compatibility/2006" xmlns:o="urn:schemas-microsoft-com:office:office" xmlns:r="http://schemas.openxmlformats.org/officeDocument/2006/relationships" xmlns:m="http://schemas.openxmlformats.org/officeDocument/2006/math" xmlns:v="urn:schemas-microsoft-com:vml" xmlns:wp14="http://schemas.microsoft.com/office/word/2010/wordprocessingDrawing" xmlns:wp="http://schemas.openxmlformats.org/drawingml/2006/wordprocessingDrawing" xmlns:w10="urn:schemas-microsoft-com:office:word" xmlns:w="http://schemas.openxmlformats.org/wordprocessingml/2006/main" xmlns:w14="http://schemas.microsoft.com/office/word/2010/wordml" xmlns:w15="http://schemas.microsoft.com/office/word/2012/wordml" xmlns:w16se="http://schemas.microsoft.com/office/word/2015/wordml/symex" xmlns:w16cid="http://schemas.microsoft.com/office/word/2016/wordml/cid" xmlns:w16="http://schemas.microsoft.com/office/word/2018/wordml" xmlns:w16cex="http://schemas.microsoft.com/office/word/2018/wordml/cex" xmlns:w16sdtdh="http://schemas.microsoft.com/office/word/2020/wordml/sdtdatahash" xmlns:wne="http://schemas.microsoft.com/office/word/2006/wordml" xmlns:wpg="http://schemas.microsoft.com/office/word/2010/wordprocessingGroup" xmlns:wps="http://schemas.microsoft.com/office/word/2010/wordprocessingShape">
   <w:p>
-    <w:pPr>
-      <w:pStyle w:val="Header"/>
-    </w:pPr>
     <w:r>
       <w:rPr>
         <w:noProof/>
       </w:rPr>
-      <w:pict w14:anchorId="025173C2">
+      <w:pict>
         <v:shapetype id="_x0000_t136" coordsize="21600,21600" o:spt="136" adj="10800" path="m@7,l@8,m@5,21600l@6,21600e">
           <v:formulas>
             <v:f eqn="sum #0 0 10800"/>
@@ -1849,34 +1883,37 @@
             <v:f eqn="mid @6 @7"/>
             <v:f eqn="sum @6 0 @5"/>
           </v:formulas>
-          <v:path textpathok="t" o:connecttype="custom" o:connectlocs="@9,0;@10,10800;@11,21600;@12,10800" o:connectangles="270,180,90,0"/>
+          <v:path textpathok="t" o:connecttype="custom" o:connectlocs="@9,0;@10,10800;@9,21600;@11,10800" o:connectangles="270,180,90,0"/>
           <v:textpath on="t" fitshape="t"/>
           <v:handles>
             <v:h position="#0,bottomRight" xrange="6629,14971"/>
           </v:handles>
           <o:lock v:ext="edit" text="t" shapetype="t"/>
         </v:shapetype>
-        <v:shape id="PowerPlusWaterMarkObject952876422" o:spid="_x0000_s1032" type="#_x0000_t136" style="position:absolute;margin-left:0;margin-top:0;width:174pt;height:54pt;rotation:315;z-index:-251655168;mso-position-horizontal:center;mso-position-horizontal-relative:margin;mso-position-vertical:center;mso-position-vertical-relative:margin" o:allowincell="f" fillcolor="#d8d8d8 [2732]" stroked="f">
+        <v:shape id="PowerPlusWaterMarkObject1" o:spid="_x0000_s2049" type="#_x0000_t136" style="position:absolute;margin-left:0;margin-top:0;width:208pt;height:104pt;rotation:315;z-index:-251658240;mso-position-horizontal:center;mso-position-horizontal-relative:margin;mso-position-vertical:center;mso-position-vertical-relative:margin" o:allowincell="f" fillcolor="#d8d8d8 [2732]" stroked="f">
           <v:fill opacity=".5"/>
-          <v:textpath style="font-family:&quot;Calibri&quot;;font-size:44pt" string="ORIGINAL"/>
+          <v:textpath style="font-family:&quot;Calibri&quot;;font-size:1pt" string="ORIGINAL"/>
         </v:shape>
       </w:pict>
     </w:r>
+  </w:p>
+  <w:p>
+    <w:pPr>
+      <w:pStyle w:val="Header"/>
+    </w:pPr>
+    <w:r/>
   </w:p>
 </w:hdr>
 </file>
 
 <file path=word/header2.xml><?xml version="1.0" encoding="utf-8"?>
-<w:hdr xmlns:wpc="http://schemas.microsoft.com/office/word/2010/wordprocessingCanvas" xmlns:cx="http://schemas.microsoft.com/office/drawing/2014/chartex" xmlns:cx1="http://schemas.microsoft.com/office/drawing/2015/9/8/chartex" xmlns:cx2="http://schemas.microsoft.com/office/drawing/2015/10/21/chartex" xmlns:cx3="http://schemas.microsoft.com/office/drawing/2016/5/9/chartex" xmlns:cx4="http://schemas.microsoft.com/office/drawing/2016/5/10/chartex" xmlns:cx5="http://schemas.microsoft.com/office/drawing/2016/5/11/chartex" xmlns:cx6="http://schemas.microsoft.com/office/drawing/2016/5/12/chartex" xmlns:cx7="http://schemas.microsoft.com/office/drawing/2016/5/13/chartex" xmlns:cx8="http://schemas.microsoft.com/office/drawing/2016/5/14/chartex" xmlns:mc="http://schemas.openxmlformats.org/markup-compatibility/2006" xmlns:aink="http://schemas.microsoft.com/office/drawing/2016/ink" xmlns:am3d="http://schemas.microsoft.com/office/drawing/2017/model3d" xmlns:o="urn:schemas-microsoft-com:office:office" xmlns:oel="http://schemas.microsoft.com/office/2019/extlst" xmlns:r="http://schemas.openxmlformats.org/officeDocument/2006/relationships" xmlns:m="http://schemas.openxmlformats.org/officeDocument/2006/math" xmlns:v="urn:schemas-microsoft-com:vml" xmlns:wp14="http://schemas.microsoft.com/office/word/2010/wordprocessingDrawing" xmlns:wp="http://schemas.openxmlformats.org/drawingml/2006/wordprocessingDrawing" xmlns:w10="urn:schemas-microsoft-com:office:word" xmlns:w="http://schemas.openxmlformats.org/wordprocessingml/2006/main" xmlns:w14="http://schemas.microsoft.com/office/word/2010/wordml" xmlns:w15="http://schemas.microsoft.com/office/word/2012/wordml" xmlns:w16cex="http://schemas.microsoft.com/office/word/2018/wordml/cex" xmlns:w16cid="http://schemas.microsoft.com/office/word/2016/wordml/cid" xmlns:w16="http://schemas.microsoft.com/office/word/2018/wordml" xmlns:w16du="http://schemas.microsoft.com/office/word/2023/wordml/word16du" xmlns:w16sdtdh="http://schemas.microsoft.com/office/word/2020/wordml/sdtdatahash" xmlns:w16sdtfl="http://schemas.microsoft.com/office/word/2024/wordml/sdtformatlock" xmlns:w16se="http://schemas.microsoft.com/office/word/2015/wordml/symex" xmlns:wpg="http://schemas.microsoft.com/office/word/2010/wordprocessingGroup" xmlns:wpi="http://schemas.microsoft.com/office/word/2010/wordprocessingInk" xmlns:wne="http://schemas.microsoft.com/office/word/2006/wordml" xmlns:wps="http://schemas.microsoft.com/office/word/2010/wordprocessingShape" mc:Ignorable="w14 w15 w16se w16cid w16 w16cex w16sdtdh w16sdtfl w16du wp14">
+<w:hdr xmlns:wpc="http://schemas.microsoft.com/office/word/2010/wordprocessingCanvas" xmlns:mc="http://schemas.openxmlformats.org/markup-compatibility/2006" xmlns:o="urn:schemas-microsoft-com:office:office" xmlns:r="http://schemas.openxmlformats.org/officeDocument/2006/relationships" xmlns:m="http://schemas.openxmlformats.org/officeDocument/2006/math" xmlns:v="urn:schemas-microsoft-com:vml" xmlns:wp14="http://schemas.microsoft.com/office/word/2010/wordprocessingDrawing" xmlns:wp="http://schemas.openxmlformats.org/drawingml/2006/wordprocessingDrawing" xmlns:w10="urn:schemas-microsoft-com:office:word" xmlns:w="http://schemas.openxmlformats.org/wordprocessingml/2006/main" xmlns:w14="http://schemas.microsoft.com/office/word/2010/wordml" xmlns:w15="http://schemas.microsoft.com/office/word/2012/wordml" xmlns:w16se="http://schemas.microsoft.com/office/word/2015/wordml/symex" xmlns:w16cid="http://schemas.microsoft.com/office/word/2016/wordml/cid" xmlns:w16="http://schemas.microsoft.com/office/word/2018/wordml" xmlns:w16cex="http://schemas.microsoft.com/office/word/2018/wordml/cex" xmlns:w16sdtdh="http://schemas.microsoft.com/office/word/2020/wordml/sdtdatahash" xmlns:wne="http://schemas.microsoft.com/office/word/2006/wordml" xmlns:wpg="http://schemas.microsoft.com/office/word/2010/wordprocessingGroup" xmlns:wps="http://schemas.microsoft.com/office/word/2010/wordprocessingShape">
   <w:p>
-    <w:pPr>
-      <w:pStyle w:val="Header"/>
-    </w:pPr>
     <w:r>
       <w:rPr>
         <w:noProof/>
       </w:rPr>
-      <w:pict w14:anchorId="2A2A60BA">
+      <w:pict>
         <v:shapetype id="_x0000_t136" coordsize="21600,21600" o:spt="136" adj="10800" path="m@7,l@8,m@5,21600l@6,21600e">
           <v:formulas>
             <v:f eqn="sum #0 0 10800"/>
@@ -1894,34 +1931,37 @@
             <v:f eqn="mid @6 @7"/>
             <v:f eqn="sum @6 0 @5"/>
           </v:formulas>
-          <v:path textpathok="t" o:connecttype="custom" o:connectlocs="@9,0;@10,10800;@11,21600;@12,10800" o:connectangles="270,180,90,0"/>
+          <v:path textpathok="t" o:connecttype="custom" o:connectlocs="@9,0;@10,10800;@9,21600;@11,10800" o:connectangles="270,180,90,0"/>
           <v:textpath on="t" fitshape="t"/>
           <v:handles>
             <v:h position="#0,bottomRight" xrange="6629,14971"/>
           </v:handles>
           <o:lock v:ext="edit" text="t" shapetype="t"/>
         </v:shapetype>
-        <v:shape id="PowerPlusWaterMarkObject952876423" o:spid="_x0000_s1033" type="#_x0000_t136" style="position:absolute;margin-left:0;margin-top:0;width:174pt;height:54pt;rotation:315;z-index:-251653120;mso-position-horizontal:center;mso-position-horizontal-relative:margin;mso-position-vertical:center;mso-position-vertical-relative:margin" o:allowincell="f" fillcolor="#d8d8d8 [2732]" stroked="f">
+        <v:shape id="PowerPlusWaterMarkObject1" o:spid="_x0000_s2049" type="#_x0000_t136" style="position:absolute;margin-left:0;margin-top:0;width:208pt;height:104pt;rotation:315;z-index:-251658240;mso-position-horizontal:center;mso-position-horizontal-relative:margin;mso-position-vertical:center;mso-position-vertical-relative:margin" o:allowincell="f" fillcolor="#d8d8d8 [2732]" stroked="f">
           <v:fill opacity=".5"/>
-          <v:textpath style="font-family:&quot;Calibri&quot;;font-size:44pt" string="ORIGINAL"/>
+          <v:textpath style="font-family:&quot;Calibri&quot;;font-size:1pt" string="ORIGINAL"/>
         </v:shape>
       </w:pict>
     </w:r>
+  </w:p>
+  <w:p>
+    <w:pPr>
+      <w:pStyle w:val="Header"/>
+    </w:pPr>
+    <w:r/>
   </w:p>
 </w:hdr>
 </file>
 
 <file path=word/header3.xml><?xml version="1.0" encoding="utf-8"?>
-<w:hdr xmlns:wpc="http://schemas.microsoft.com/office/word/2010/wordprocessingCanvas" xmlns:cx="http://schemas.microsoft.com/office/drawing/2014/chartex" xmlns:cx1="http://schemas.microsoft.com/office/drawing/2015/9/8/chartex" xmlns:cx2="http://schemas.microsoft.com/office/drawing/2015/10/21/chartex" xmlns:cx3="http://schemas.microsoft.com/office/drawing/2016/5/9/chartex" xmlns:cx4="http://schemas.microsoft.com/office/drawing/2016/5/10/chartex" xmlns:cx5="http://schemas.microsoft.com/office/drawing/2016/5/11/chartex" xmlns:cx6="http://schemas.microsoft.com/office/drawing/2016/5/12/chartex" xmlns:cx7="http://schemas.microsoft.com/office/drawing/2016/5/13/chartex" xmlns:cx8="http://schemas.microsoft.com/office/drawing/2016/5/14/chartex" xmlns:mc="http://schemas.openxmlformats.org/markup-compatibility/2006" xmlns:aink="http://schemas.microsoft.com/office/drawing/2016/ink" xmlns:am3d="http://schemas.microsoft.com/office/drawing/2017/model3d" xmlns:o="urn:schemas-microsoft-com:office:office" xmlns:oel="http://schemas.microsoft.com/office/2019/extlst" xmlns:r="http://schemas.openxmlformats.org/officeDocument/2006/relationships" xmlns:m="http://schemas.openxmlformats.org/officeDocument/2006/math" xmlns:v="urn:schemas-microsoft-com:vml" xmlns:wp14="http://schemas.microsoft.com/office/word/2010/wordprocessingDrawing" xmlns:wp="http://schemas.openxmlformats.org/drawingml/2006/wordprocessingDrawing" xmlns:w10="urn:schemas-microsoft-com:office:word" xmlns:w="http://schemas.openxmlformats.org/wordprocessingml/2006/main" xmlns:w14="http://schemas.microsoft.com/office/word/2010/wordml" xmlns:w15="http://schemas.microsoft.com/office/word/2012/wordml" xmlns:w16cex="http://schemas.microsoft.com/office/word/2018/wordml/cex" xmlns:w16cid="http://schemas.microsoft.com/office/word/2016/wordml/cid" xmlns:w16="http://schemas.microsoft.com/office/word/2018/wordml" xmlns:w16du="http://schemas.microsoft.com/office/word/2023/wordml/word16du" xmlns:w16sdtdh="http://schemas.microsoft.com/office/word/2020/wordml/sdtdatahash" xmlns:w16sdtfl="http://schemas.microsoft.com/office/word/2024/wordml/sdtformatlock" xmlns:w16se="http://schemas.microsoft.com/office/word/2015/wordml/symex" xmlns:wpg="http://schemas.microsoft.com/office/word/2010/wordprocessingGroup" xmlns:wpi="http://schemas.microsoft.com/office/word/2010/wordprocessingInk" xmlns:wne="http://schemas.microsoft.com/office/word/2006/wordml" xmlns:wps="http://schemas.microsoft.com/office/word/2010/wordprocessingShape" mc:Ignorable="w14 w15 w16se w16cid w16 w16cex w16sdtdh w16sdtfl w16du wp14">
+<w:hdr xmlns:wpc="http://schemas.microsoft.com/office/word/2010/wordprocessingCanvas" xmlns:mc="http://schemas.openxmlformats.org/markup-compatibility/2006" xmlns:o="urn:schemas-microsoft-com:office:office" xmlns:r="http://schemas.openxmlformats.org/officeDocument/2006/relationships" xmlns:m="http://schemas.openxmlformats.org/officeDocument/2006/math" xmlns:v="urn:schemas-microsoft-com:vml" xmlns:wp14="http://schemas.microsoft.com/office/word/2010/wordprocessingDrawing" xmlns:wp="http://schemas.openxmlformats.org/drawingml/2006/wordprocessingDrawing" xmlns:w10="urn:schemas-microsoft-com:office:word" xmlns:w="http://schemas.openxmlformats.org/wordprocessingml/2006/main" xmlns:w14="http://schemas.microsoft.com/office/word/2010/wordml" xmlns:w15="http://schemas.microsoft.com/office/word/2012/wordml" xmlns:w16se="http://schemas.microsoft.com/office/word/2015/wordml/symex" xmlns:w16cid="http://schemas.microsoft.com/office/word/2016/wordml/cid" xmlns:w16="http://schemas.microsoft.com/office/word/2018/wordml" xmlns:w16cex="http://schemas.microsoft.com/office/word/2018/wordml/cex" xmlns:w16sdtdh="http://schemas.microsoft.com/office/word/2020/wordml/sdtdatahash" xmlns:wne="http://schemas.microsoft.com/office/word/2006/wordml" xmlns:wpg="http://schemas.microsoft.com/office/word/2010/wordprocessingGroup" xmlns:wps="http://schemas.microsoft.com/office/word/2010/wordprocessingShape">
   <w:p>
-    <w:pPr>
-      <w:pStyle w:val="Header"/>
-    </w:pPr>
     <w:r>
       <w:rPr>
         <w:noProof/>
       </w:rPr>
-      <w:pict w14:anchorId="504C4452">
+      <w:pict>
         <v:shapetype id="_x0000_t136" coordsize="21600,21600" o:spt="136" adj="10800" path="m@7,l@8,m@5,21600l@6,21600e">
           <v:formulas>
             <v:f eqn="sum #0 0 10800"/>
@@ -1939,19 +1979,25 @@
             <v:f eqn="mid @6 @7"/>
             <v:f eqn="sum @6 0 @5"/>
           </v:formulas>
-          <v:path textpathok="t" o:connecttype="custom" o:connectlocs="@9,0;@10,10800;@11,21600;@12,10800" o:connectangles="270,180,90,0"/>
+          <v:path textpathok="t" o:connecttype="custom" o:connectlocs="@9,0;@10,10800;@9,21600;@11,10800" o:connectangles="270,180,90,0"/>
           <v:textpath on="t" fitshape="t"/>
           <v:handles>
             <v:h position="#0,bottomRight" xrange="6629,14971"/>
           </v:handles>
           <o:lock v:ext="edit" text="t" shapetype="t"/>
         </v:shapetype>
-        <v:shape id="PowerPlusWaterMarkObject952876421" o:spid="_x0000_s1031" type="#_x0000_t136" style="position:absolute;margin-left:0;margin-top:0;width:174pt;height:54pt;rotation:315;z-index:-251657216;mso-position-horizontal:center;mso-position-horizontal-relative:margin;mso-position-vertical:center;mso-position-vertical-relative:margin" o:allowincell="f" fillcolor="#d8d8d8 [2732]" stroked="f">
+        <v:shape id="PowerPlusWaterMarkObject1" o:spid="_x0000_s2049" type="#_x0000_t136" style="position:absolute;margin-left:0;margin-top:0;width:208pt;height:104pt;rotation:315;z-index:-251658240;mso-position-horizontal:center;mso-position-horizontal-relative:margin;mso-position-vertical:center;mso-position-vertical-relative:margin" o:allowincell="f" fillcolor="#d8d8d8 [2732]" stroked="f">
           <v:fill opacity=".5"/>
-          <v:textpath style="font-family:&quot;Calibri&quot;;font-size:44pt" string="ORIGINAL"/>
+          <v:textpath style="font-family:&quot;Calibri&quot;;font-size:1pt" string="ORIGINAL"/>
         </v:shape>
       </w:pict>
     </w:r>
+  </w:p>
+  <w:p>
+    <w:pPr>
+      <w:pStyle w:val="Header"/>
+    </w:pPr>
+    <w:r/>
   </w:p>
 </w:hdr>
 </file>

</xml_diff>